<commit_message>
style: change font size
</commit_message>
<xml_diff>
--- a/GROUP_REPORT/2. GROUP1_REPORT_PTTKHTTT.docx
+++ b/GROUP_REPORT/2. GROUP1_REPORT_PTTKHTTT.docx
@@ -3219,8 +3219,8 @@
           <w:rFonts w:hint="default" w:ascii="Times New Roman" w:hAnsi="Times New Roman" w:eastAsia="SimSun" w:cs="Times New Roman"/>
           <w:b/>
           <w:bCs/>
-          <w:sz w:val="26"/>
-          <w:szCs w:val="26"/>
+          <w:sz w:val="28"/>
+          <w:szCs w:val="28"/>
           <w:lang w:val="vi-VN"/>
         </w:rPr>
         <w:t>MỤC LỤC</w:t>
@@ -7588,8 +7588,8 @@
           <w:rFonts w:hint="default" w:ascii="Times New Roman" w:hAnsi="Times New Roman" w:eastAsia="SimSun" w:cs="Times New Roman"/>
           <w:b/>
           <w:bCs/>
-          <w:sz w:val="26"/>
-          <w:szCs w:val="26"/>
+          <w:sz w:val="28"/>
+          <w:szCs w:val="28"/>
           <w:lang w:val="vi-VN" w:eastAsia="en-US" w:bidi="ar-SA"/>
         </w:rPr>
       </w:pPr>
@@ -7599,8 +7599,8 @@
           <w:rFonts w:hint="default" w:ascii="Times New Roman" w:hAnsi="Times New Roman" w:eastAsia="SimSun" w:cs="Times New Roman"/>
           <w:b/>
           <w:bCs/>
-          <w:sz w:val="26"/>
-          <w:szCs w:val="26"/>
+          <w:sz w:val="28"/>
+          <w:szCs w:val="28"/>
           <w:lang w:val="vi-VN" w:eastAsia="en-US" w:bidi="ar-SA"/>
         </w:rPr>
         <w:t>DANH MỤC CÁC KÝ HIỆU, CÁC CHỮ VIẾT TẮT</w:t>
@@ -8593,8 +8593,8 @@
           <w:rFonts w:hint="default" w:ascii="Times New Roman" w:hAnsi="Times New Roman" w:eastAsia="SimSun" w:cs="Times New Roman"/>
           <w:b/>
           <w:bCs/>
-          <w:sz w:val="26"/>
-          <w:szCs w:val="26"/>
+          <w:sz w:val="28"/>
+          <w:szCs w:val="28"/>
           <w:lang w:val="vi-VN" w:eastAsia="en-US"/>
         </w:rPr>
       </w:pPr>
@@ -8603,8 +8603,8 @@
           <w:rFonts w:hint="default" w:ascii="Times New Roman" w:hAnsi="Times New Roman" w:eastAsia="SimSun" w:cs="Times New Roman"/>
           <w:b/>
           <w:bCs/>
-          <w:sz w:val="26"/>
-          <w:szCs w:val="26"/>
+          <w:sz w:val="28"/>
+          <w:szCs w:val="28"/>
           <w:lang w:val="vi-VN" w:eastAsia="en-US"/>
         </w:rPr>
         <w:t>DANH MỤC HÌNH ẢNH</w:t>
@@ -13108,8 +13108,8 @@
         <w:jc w:val="center"/>
         <w:rPr>
           <w:rFonts w:hint="default"/>
-          <w:sz w:val="30"/>
-          <w:szCs w:val="30"/>
+          <w:sz w:val="28"/>
+          <w:szCs w:val="28"/>
           <w:lang w:val="vi-VN" w:eastAsia="en-US"/>
         </w:rPr>
       </w:pPr>
@@ -13118,8 +13118,8 @@
           <w:rFonts w:hint="default" w:ascii="Times New Roman" w:hAnsi="Times New Roman" w:eastAsia="SimSun" w:cs="Times New Roman"/>
           <w:b/>
           <w:bCs/>
-          <w:sz w:val="30"/>
-          <w:szCs w:val="30"/>
+          <w:sz w:val="28"/>
+          <w:szCs w:val="28"/>
           <w:lang w:val="vi-VN" w:eastAsia="en-US"/>
         </w:rPr>
         <w:t>DANH MỤC BẢNG</w:t>
@@ -15390,7 +15390,17 @@
           <w:sz w:val="26"/>
           <w:szCs w:val="26"/>
         </w:rPr>
-        <w:t xml:space="preserve">Cửa hàng bán hàng tại Ký túc xá K8, thuộc khuôn viên Trường Đại học Nha Trang, đóng vai trò là </w:t>
+        <w:t>Cửa hàng bá</w:t>
+      </w:r>
+      <w:bookmarkStart w:id="111" w:name="_GoBack"/>
+      <w:bookmarkEnd w:id="111"/>
+      <w:r>
+        <w:rPr>
+          <w:rFonts w:hint="default" w:ascii="Times New Roman" w:hAnsi="Times New Roman" w:cs="Times New Roman"/>
+          <w:sz w:val="26"/>
+          <w:szCs w:val="26"/>
+        </w:rPr>
+        <w:t xml:space="preserve">n hàng tại Ký túc xá K8, thuộc khuôn viên Trường Đại học Nha Trang, đóng vai trò là </w:t>
       </w:r>
       <w:r>
         <w:rPr>
@@ -16056,8 +16066,8 @@
           <w:lang w:val="vi-VN" w:eastAsia="en-US"/>
         </w:rPr>
       </w:pPr>
-      <w:bookmarkStart w:id="9" w:name="_Toc27098"/>
-      <w:bookmarkStart w:id="10" w:name="_Toc10295"/>
+      <w:bookmarkStart w:id="9" w:name="_Toc10295"/>
+      <w:bookmarkStart w:id="10" w:name="_Toc27098"/>
       <w:r>
         <w:rPr>
           <w:rFonts w:hint="default" w:ascii="Times New Roman" w:hAnsi="Times New Roman" w:cs="Times New Roman"/>
@@ -16399,8 +16409,8 @@
         </w:rPr>
       </w:pPr>
       <w:bookmarkStart w:id="14" w:name="_Toc13210"/>
-      <w:bookmarkStart w:id="15" w:name="_Toc11757"/>
-      <w:bookmarkStart w:id="16" w:name="_Toc13087"/>
+      <w:bookmarkStart w:id="15" w:name="_Toc13087"/>
+      <w:bookmarkStart w:id="16" w:name="_Toc11757"/>
       <w:r>
         <w:rPr>
           <w:rFonts w:hint="default" w:ascii="Times New Roman" w:hAnsi="Times New Roman" w:cs="Times New Roman"/>
@@ -16572,8 +16582,8 @@
         </w:rPr>
       </w:pPr>
       <w:bookmarkStart w:id="17" w:name="_Toc16091"/>
-      <w:bookmarkStart w:id="18" w:name="_Toc5413"/>
-      <w:bookmarkStart w:id="19" w:name="_Toc14206"/>
+      <w:bookmarkStart w:id="18" w:name="_Toc14206"/>
+      <w:bookmarkStart w:id="19" w:name="_Toc5413"/>
       <w:r>
         <w:rPr>
           <w:rFonts w:hint="default" w:ascii="Times New Roman" w:hAnsi="Times New Roman" w:cs="Times New Roman"/>
@@ -17150,169 +17160,6 @@
             <w:insideH w:val="single" w:color="auto" w:sz="4" w:space="0"/>
             <w:insideV w:val="single" w:color="auto" w:sz="4" w:space="0"/>
           </w:tblBorders>
-          <w:tblCellMar>
-            <w:top w:w="15" w:type="dxa"/>
-            <w:left w:w="15" w:type="dxa"/>
-            <w:bottom w:w="15" w:type="dxa"/>
-            <w:right w:w="15" w:type="dxa"/>
-          </w:tblCellMar>
-        </w:tblPrEx>
-        <w:trPr>
-          <w:trHeight w:val="567" w:hRule="atLeast"/>
-        </w:trPr>
-        <w:tc>
-          <w:tcPr>
-            <w:tcW w:w="834" w:type="pct"/>
-            <w:shd w:val="clear" w:color="auto" w:fill="FFFFFF"/>
-            <w:tcMar>
-              <w:top w:w="120" w:type="dxa"/>
-              <w:left w:w="180" w:type="dxa"/>
-              <w:bottom w:w="120" w:type="dxa"/>
-              <w:right w:w="180" w:type="dxa"/>
-            </w:tcMar>
-            <w:vAlign w:val="center"/>
-          </w:tcPr>
-          <w:p>
-            <w:pPr>
-              <w:pageBreakBefore w:val="0"/>
-              <w:widowControl/>
-              <w:kinsoku/>
-              <w:wordWrap/>
-              <w:overflowPunct/>
-              <w:topLinePunct w:val="0"/>
-              <w:autoSpaceDE/>
-              <w:autoSpaceDN/>
-              <w:bidi w:val="0"/>
-              <w:adjustRightInd/>
-              <w:snapToGrid/>
-              <w:spacing w:before="120" w:after="120" w:line="360" w:lineRule="auto"/>
-              <w:jc w:val="center"/>
-              <w:textAlignment w:val="auto"/>
-              <w:rPr>
-                <w:rFonts w:hint="default" w:ascii="Times New Roman" w:hAnsi="Times New Roman" w:cs="Times New Roman"/>
-                <w:b/>
-                <w:bCs/>
-                <w:color w:val="000000"/>
-                <w:sz w:val="26"/>
-                <w:szCs w:val="26"/>
-              </w:rPr>
-            </w:pPr>
-            <w:r>
-              <w:rPr>
-                <w:rFonts w:hint="default" w:ascii="Times New Roman" w:hAnsi="Times New Roman" w:cs="Times New Roman"/>
-                <w:b/>
-                <w:bCs/>
-                <w:color w:val="000000"/>
-                <w:sz w:val="26"/>
-                <w:szCs w:val="26"/>
-              </w:rPr>
-              <w:t>Giao dịch</w:t>
-            </w:r>
-          </w:p>
-        </w:tc>
-        <w:tc>
-          <w:tcPr>
-            <w:tcW w:w="1909" w:type="pct"/>
-            <w:shd w:val="clear" w:color="auto" w:fill="FFFFFF"/>
-            <w:tcMar>
-              <w:top w:w="120" w:type="dxa"/>
-              <w:left w:w="180" w:type="dxa"/>
-              <w:bottom w:w="120" w:type="dxa"/>
-              <w:right w:w="180" w:type="dxa"/>
-            </w:tcMar>
-            <w:vAlign w:val="center"/>
-          </w:tcPr>
-          <w:p>
-            <w:pPr>
-              <w:pageBreakBefore w:val="0"/>
-              <w:widowControl/>
-              <w:kinsoku/>
-              <w:wordWrap/>
-              <w:overflowPunct/>
-              <w:topLinePunct w:val="0"/>
-              <w:autoSpaceDE/>
-              <w:autoSpaceDN/>
-              <w:bidi w:val="0"/>
-              <w:adjustRightInd/>
-              <w:snapToGrid/>
-              <w:spacing w:before="120" w:after="120" w:line="360" w:lineRule="auto"/>
-              <w:jc w:val="left"/>
-              <w:textAlignment w:val="auto"/>
-              <w:rPr>
-                <w:rFonts w:hint="default" w:ascii="Times New Roman" w:hAnsi="Times New Roman" w:cs="Times New Roman"/>
-                <w:color w:val="000000"/>
-                <w:sz w:val="26"/>
-                <w:szCs w:val="26"/>
-              </w:rPr>
-            </w:pPr>
-            <w:r>
-              <w:rPr>
-                <w:rFonts w:hint="default" w:ascii="Times New Roman" w:hAnsi="Times New Roman" w:cs="Times New Roman"/>
-                <w:color w:val="000000"/>
-                <w:sz w:val="26"/>
-                <w:szCs w:val="26"/>
-              </w:rPr>
-              <w:t>Tự động tính toán chính xác. Lưu trữ được lịch sử hóa đơn.</w:t>
-            </w:r>
-          </w:p>
-        </w:tc>
-        <w:tc>
-          <w:tcPr>
-            <w:tcW w:w="2256" w:type="pct"/>
-            <w:shd w:val="clear" w:color="auto" w:fill="FFFFFF"/>
-            <w:tcMar>
-              <w:top w:w="120" w:type="dxa"/>
-              <w:left w:w="180" w:type="dxa"/>
-              <w:bottom w:w="120" w:type="dxa"/>
-              <w:right w:w="180" w:type="dxa"/>
-            </w:tcMar>
-            <w:vAlign w:val="center"/>
-          </w:tcPr>
-          <w:p>
-            <w:pPr>
-              <w:pageBreakBefore w:val="0"/>
-              <w:widowControl/>
-              <w:kinsoku/>
-              <w:wordWrap/>
-              <w:overflowPunct/>
-              <w:topLinePunct w:val="0"/>
-              <w:autoSpaceDE/>
-              <w:autoSpaceDN/>
-              <w:bidi w:val="0"/>
-              <w:adjustRightInd/>
-              <w:snapToGrid/>
-              <w:spacing w:before="120" w:after="120" w:line="360" w:lineRule="auto"/>
-              <w:jc w:val="left"/>
-              <w:textAlignment w:val="auto"/>
-              <w:rPr>
-                <w:rFonts w:hint="default" w:ascii="Times New Roman" w:hAnsi="Times New Roman" w:cs="Times New Roman"/>
-                <w:color w:val="000000"/>
-                <w:sz w:val="26"/>
-                <w:szCs w:val="26"/>
-              </w:rPr>
-            </w:pPr>
-            <w:r>
-              <w:rPr>
-                <w:rFonts w:hint="default" w:ascii="Times New Roman" w:hAnsi="Times New Roman" w:cs="Times New Roman"/>
-                <w:color w:val="000000"/>
-                <w:sz w:val="26"/>
-                <w:szCs w:val="26"/>
-              </w:rPr>
-              <w:t>Không có liên kết với tồn kho (gây sai sót khi bán).</w:t>
-            </w:r>
-          </w:p>
-        </w:tc>
-      </w:tr>
-      <w:tr>
-        <w:tblPrEx>
-          <w:tblBorders>
-            <w:top w:val="single" w:color="auto" w:sz="4" w:space="0"/>
-            <w:left w:val="single" w:color="auto" w:sz="4" w:space="0"/>
-            <w:bottom w:val="single" w:color="auto" w:sz="4" w:space="0"/>
-            <w:right w:val="single" w:color="auto" w:sz="4" w:space="0"/>
-            <w:insideH w:val="single" w:color="auto" w:sz="4" w:space="0"/>
-            <w:insideV w:val="single" w:color="auto" w:sz="4" w:space="0"/>
-          </w:tblBorders>
           <w:shd w:val="clear" w:color="auto" w:fill="auto"/>
           <w:tblCellMar>
             <w:top w:w="15" w:type="dxa"/>
@@ -17370,6 +17217,169 @@
                 <w:sz w:val="26"/>
                 <w:szCs w:val="26"/>
               </w:rPr>
+              <w:t>Giao dịch</w:t>
+            </w:r>
+          </w:p>
+        </w:tc>
+        <w:tc>
+          <w:tcPr>
+            <w:tcW w:w="1909" w:type="pct"/>
+            <w:shd w:val="clear" w:color="auto" w:fill="FFFFFF"/>
+            <w:tcMar>
+              <w:top w:w="120" w:type="dxa"/>
+              <w:left w:w="180" w:type="dxa"/>
+              <w:bottom w:w="120" w:type="dxa"/>
+              <w:right w:w="180" w:type="dxa"/>
+            </w:tcMar>
+            <w:vAlign w:val="center"/>
+          </w:tcPr>
+          <w:p>
+            <w:pPr>
+              <w:pageBreakBefore w:val="0"/>
+              <w:widowControl/>
+              <w:kinsoku/>
+              <w:wordWrap/>
+              <w:overflowPunct/>
+              <w:topLinePunct w:val="0"/>
+              <w:autoSpaceDE/>
+              <w:autoSpaceDN/>
+              <w:bidi w:val="0"/>
+              <w:adjustRightInd/>
+              <w:snapToGrid/>
+              <w:spacing w:before="120" w:after="120" w:line="360" w:lineRule="auto"/>
+              <w:jc w:val="left"/>
+              <w:textAlignment w:val="auto"/>
+              <w:rPr>
+                <w:rFonts w:hint="default" w:ascii="Times New Roman" w:hAnsi="Times New Roman" w:cs="Times New Roman"/>
+                <w:color w:val="000000"/>
+                <w:sz w:val="26"/>
+                <w:szCs w:val="26"/>
+              </w:rPr>
+            </w:pPr>
+            <w:r>
+              <w:rPr>
+                <w:rFonts w:hint="default" w:ascii="Times New Roman" w:hAnsi="Times New Roman" w:cs="Times New Roman"/>
+                <w:color w:val="000000"/>
+                <w:sz w:val="26"/>
+                <w:szCs w:val="26"/>
+              </w:rPr>
+              <w:t>Tự động tính toán chính xác. Lưu trữ được lịch sử hóa đơn.</w:t>
+            </w:r>
+          </w:p>
+        </w:tc>
+        <w:tc>
+          <w:tcPr>
+            <w:tcW w:w="2256" w:type="pct"/>
+            <w:shd w:val="clear" w:color="auto" w:fill="FFFFFF"/>
+            <w:tcMar>
+              <w:top w:w="120" w:type="dxa"/>
+              <w:left w:w="180" w:type="dxa"/>
+              <w:bottom w:w="120" w:type="dxa"/>
+              <w:right w:w="180" w:type="dxa"/>
+            </w:tcMar>
+            <w:vAlign w:val="center"/>
+          </w:tcPr>
+          <w:p>
+            <w:pPr>
+              <w:pageBreakBefore w:val="0"/>
+              <w:widowControl/>
+              <w:kinsoku/>
+              <w:wordWrap/>
+              <w:overflowPunct/>
+              <w:topLinePunct w:val="0"/>
+              <w:autoSpaceDE/>
+              <w:autoSpaceDN/>
+              <w:bidi w:val="0"/>
+              <w:adjustRightInd/>
+              <w:snapToGrid/>
+              <w:spacing w:before="120" w:after="120" w:line="360" w:lineRule="auto"/>
+              <w:jc w:val="left"/>
+              <w:textAlignment w:val="auto"/>
+              <w:rPr>
+                <w:rFonts w:hint="default" w:ascii="Times New Roman" w:hAnsi="Times New Roman" w:cs="Times New Roman"/>
+                <w:color w:val="000000"/>
+                <w:sz w:val="26"/>
+                <w:szCs w:val="26"/>
+              </w:rPr>
+            </w:pPr>
+            <w:r>
+              <w:rPr>
+                <w:rFonts w:hint="default" w:ascii="Times New Roman" w:hAnsi="Times New Roman" w:cs="Times New Roman"/>
+                <w:color w:val="000000"/>
+                <w:sz w:val="26"/>
+                <w:szCs w:val="26"/>
+              </w:rPr>
+              <w:t>Không có liên kết với tồn kho (gây sai sót khi bán).</w:t>
+            </w:r>
+          </w:p>
+        </w:tc>
+      </w:tr>
+      <w:tr>
+        <w:tblPrEx>
+          <w:tblBorders>
+            <w:top w:val="single" w:color="auto" w:sz="4" w:space="0"/>
+            <w:left w:val="single" w:color="auto" w:sz="4" w:space="0"/>
+            <w:bottom w:val="single" w:color="auto" w:sz="4" w:space="0"/>
+            <w:right w:val="single" w:color="auto" w:sz="4" w:space="0"/>
+            <w:insideH w:val="single" w:color="auto" w:sz="4" w:space="0"/>
+            <w:insideV w:val="single" w:color="auto" w:sz="4" w:space="0"/>
+          </w:tblBorders>
+          <w:tblCellMar>
+            <w:top w:w="15" w:type="dxa"/>
+            <w:left w:w="15" w:type="dxa"/>
+            <w:bottom w:w="15" w:type="dxa"/>
+            <w:right w:w="15" w:type="dxa"/>
+          </w:tblCellMar>
+        </w:tblPrEx>
+        <w:trPr>
+          <w:trHeight w:val="567" w:hRule="atLeast"/>
+        </w:trPr>
+        <w:tc>
+          <w:tcPr>
+            <w:tcW w:w="834" w:type="pct"/>
+            <w:shd w:val="clear" w:color="auto" w:fill="FFFFFF"/>
+            <w:tcMar>
+              <w:top w:w="120" w:type="dxa"/>
+              <w:left w:w="180" w:type="dxa"/>
+              <w:bottom w:w="120" w:type="dxa"/>
+              <w:right w:w="180" w:type="dxa"/>
+            </w:tcMar>
+            <w:vAlign w:val="center"/>
+          </w:tcPr>
+          <w:p>
+            <w:pPr>
+              <w:pageBreakBefore w:val="0"/>
+              <w:widowControl/>
+              <w:kinsoku/>
+              <w:wordWrap/>
+              <w:overflowPunct/>
+              <w:topLinePunct w:val="0"/>
+              <w:autoSpaceDE/>
+              <w:autoSpaceDN/>
+              <w:bidi w:val="0"/>
+              <w:adjustRightInd/>
+              <w:snapToGrid/>
+              <w:spacing w:before="120" w:after="120" w:line="360" w:lineRule="auto"/>
+              <w:jc w:val="center"/>
+              <w:textAlignment w:val="auto"/>
+              <w:rPr>
+                <w:rFonts w:hint="default" w:ascii="Times New Roman" w:hAnsi="Times New Roman" w:cs="Times New Roman"/>
+                <w:b/>
+                <w:bCs/>
+                <w:color w:val="000000"/>
+                <w:sz w:val="26"/>
+                <w:szCs w:val="26"/>
+              </w:rPr>
+            </w:pPr>
+            <w:r>
+              <w:rPr>
+                <w:rFonts w:hint="default" w:ascii="Times New Roman" w:hAnsi="Times New Roman" w:cs="Times New Roman"/>
+                <w:b/>
+                <w:bCs/>
+                <w:color w:val="000000"/>
+                <w:sz w:val="26"/>
+                <w:szCs w:val="26"/>
+              </w:rPr>
               <w:t>Quản lý Dữ liệu</w:t>
             </w:r>
           </w:p>
@@ -17534,7 +17544,6 @@
             <w:insideH w:val="single" w:color="auto" w:sz="4" w:space="0"/>
             <w:insideV w:val="single" w:color="auto" w:sz="4" w:space="0"/>
           </w:tblBorders>
-          <w:shd w:val="clear" w:color="auto" w:fill="auto"/>
           <w:tblCellMar>
             <w:top w:w="15" w:type="dxa"/>
             <w:left w:w="15" w:type="dxa"/>
@@ -19359,7 +19368,6 @@
             <w:insideH w:val="single" w:color="auto" w:sz="4" w:space="0"/>
             <w:insideV w:val="single" w:color="auto" w:sz="4" w:space="0"/>
           </w:tblBorders>
-          <w:shd w:val="clear" w:color="auto" w:fill="auto"/>
           <w:tblCellMar>
             <w:top w:w="15" w:type="dxa"/>
             <w:left w:w="15" w:type="dxa"/>
@@ -19769,7 +19777,6 @@
             <w:insideH w:val="single" w:color="auto" w:sz="4" w:space="0"/>
             <w:insideV w:val="single" w:color="auto" w:sz="4" w:space="0"/>
           </w:tblBorders>
-          <w:shd w:val="clear" w:color="auto" w:fill="auto"/>
           <w:tblCellMar>
             <w:top w:w="15" w:type="dxa"/>
             <w:left w:w="15" w:type="dxa"/>
@@ -20121,7 +20128,6 @@
             <w:insideH w:val="single" w:color="auto" w:sz="4" w:space="0"/>
             <w:insideV w:val="single" w:color="auto" w:sz="4" w:space="0"/>
           </w:tblBorders>
-          <w:shd w:val="clear" w:color="auto" w:fill="auto"/>
           <w:tblCellMar>
             <w:top w:w="15" w:type="dxa"/>
             <w:left w:w="15" w:type="dxa"/>
@@ -21715,8 +21721,8 @@
         </w:rPr>
       </w:pPr>
       <w:bookmarkStart w:id="51" w:name="_Toc15075"/>
-      <w:bookmarkStart w:id="52" w:name="_Toc6802"/>
-      <w:bookmarkStart w:id="53" w:name="_Toc30621"/>
+      <w:bookmarkStart w:id="52" w:name="_Toc30621"/>
+      <w:bookmarkStart w:id="53" w:name="_Toc6802"/>
       <w:r>
         <w:rPr>
           <w:rFonts w:hint="default" w:ascii="Times New Roman" w:hAnsi="Times New Roman" w:cs="Times New Roman"/>
@@ -22149,8 +22155,8 @@
         </w:rPr>
       </w:pPr>
       <w:bookmarkStart w:id="57" w:name="_Toc19415"/>
-      <w:bookmarkStart w:id="58" w:name="_Toc23702"/>
-      <w:bookmarkStart w:id="59" w:name="_Toc4190"/>
+      <w:bookmarkStart w:id="58" w:name="_Toc4190"/>
+      <w:bookmarkStart w:id="59" w:name="_Toc23702"/>
       <w:r>
         <w:rPr>
           <w:rStyle w:val="11"/>
@@ -36590,8 +36596,8 @@
           <w:lang w:val="vi-VN"/>
         </w:rPr>
       </w:pPr>
-      <w:bookmarkStart w:id="93" w:name="_Toc10922"/>
-      <w:bookmarkStart w:id="94" w:name="_Toc8110"/>
+      <w:bookmarkStart w:id="93" w:name="_Toc8110"/>
+      <w:bookmarkStart w:id="94" w:name="_Toc10922"/>
       <w:r>
         <w:rPr>
           <w:rFonts w:hint="default" w:ascii="Times New Roman" w:hAnsi="Times New Roman" w:cs="Times New Roman"/>
@@ -36714,8 +36720,8 @@
           <w:lang w:val="vi-VN" w:eastAsia="en-US"/>
         </w:rPr>
       </w:pPr>
-      <w:bookmarkStart w:id="95" w:name="_Toc23424"/>
-      <w:bookmarkStart w:id="96" w:name="_Toc3391"/>
+      <w:bookmarkStart w:id="95" w:name="_Toc3391"/>
+      <w:bookmarkStart w:id="96" w:name="_Toc23424"/>
       <w:r>
         <w:rPr>
           <w:rFonts w:hint="default" w:ascii="Times New Roman" w:hAnsi="Times New Roman" w:cs="Times New Roman"/>
@@ -36986,8 +36992,8 @@
           <w:lang w:val="vi-VN"/>
         </w:rPr>
       </w:pPr>
-      <w:bookmarkStart w:id="99" w:name="_Toc13122"/>
-      <w:bookmarkStart w:id="100" w:name="_Toc30634"/>
+      <w:bookmarkStart w:id="99" w:name="_Toc30634"/>
+      <w:bookmarkStart w:id="100" w:name="_Toc13122"/>
       <w:r>
         <w:rPr>
           <w:rFonts w:hint="default" w:ascii="Times New Roman" w:hAnsi="Times New Roman" w:cs="Times New Roman"/>
@@ -37309,8 +37315,8 @@
           </wp:inline>
         </w:drawing>
       </w:r>
-      <w:bookmarkStart w:id="105" w:name="_Toc1743"/>
-      <w:bookmarkStart w:id="106" w:name="_Toc20570"/>
+      <w:bookmarkStart w:id="105" w:name="_Toc20570"/>
+      <w:bookmarkStart w:id="106" w:name="_Toc1743"/>
       <w:r>
         <w:rPr>
           <w:rFonts w:hint="default" w:ascii="Times New Roman" w:hAnsi="Times New Roman" w:cs="Times New Roman"/>
@@ -37351,20 +37357,7 @@
           <w:szCs w:val="26"/>
           <w:lang w:val="vi-VN" w:eastAsia="en-US" w:bidi="ar-SA"/>
         </w:rPr>
-        <w:t>20</w:t>
-      </w:r>
-      <w:bookmarkStart w:id="111" w:name="_GoBack"/>
-      <w:bookmarkEnd w:id="111"/>
-      <w:r>
-        <w:rPr>
-          <w:rFonts w:hint="default" w:ascii="Times New Roman" w:hAnsi="Times New Roman" w:cs="Times New Roman" w:eastAsiaTheme="minorEastAsia"/>
-          <w:b/>
-          <w:bCs/>
-          <w:sz w:val="26"/>
-          <w:szCs w:val="26"/>
-          <w:lang w:val="vi-VN" w:eastAsia="en-US" w:bidi="ar-SA"/>
-        </w:rPr>
-        <w:t>. Bảng Chi tiết bán hàng</w:t>
+        <w:t>20. Bảng Chi tiết bán hàng</w:t>
       </w:r>
       <w:bookmarkEnd w:id="105"/>
       <w:bookmarkEnd w:id="106"/>

</xml_diff>